<commit_message>
Added updated architecture and sequence diagrams to WellnessHub - System Design.docx
</commit_message>
<xml_diff>
--- a/Design/WellnessHub - System Design.docx
+++ b/Design/WellnessHub - System Design.docx
@@ -533,7 +533,7 @@
           <w:tab w:val="left" w:pos="6367" w:leader="none"/>
         </w:tabs>
         <w:bidi w:val="0"/>
-        <w:spacing w:lineRule="auto" w:line="360"/>
+        <w:spacing w:lineRule="auto" w:line="360" w:before="0" w:after="0"/>
         <w:jc w:val="start"/>
         <w:rPr>
           <w:rFonts w:ascii="Calibri" w:hAnsi="Calibri"/>
@@ -605,17 +605,7 @@
           <w:szCs w:val="18"/>
         </w:rPr>
         <w:tab/>
-        <w:t>WellnessHub will be built around a simple, flexible design. Users will be able to easily navigate to desired sets of wellness-related information and tracking tools through the dashboard. Such information will be generated by providers, who will have access to a Markdown-based entry system for creating article</w:t>
-      </w:r>
-      <w:r>
-        <w:rPr>
-          <w:rFonts w:ascii="Calibri" w:hAnsi="Calibri"/>
-          <w:b w:val="false"/>
-          <w:bCs w:val="false"/>
-          <w:sz w:val="24"/>
-          <w:szCs w:val="18"/>
-        </w:rPr>
-        <w:t>s. The system is designed to be implemented in a modular manner, making possible additions such as a dedicated mobile app and a future transition to a fully serverless model without disrupting the user experience.</w:t>
+        <w:t>WellnessHub will be built around a simple, flexible design. Users will be able to easily navigate to desired sets of wellness-related information and tracking tools through the dashboard. Such information will be generated by providers, who will have access to a Markdown-based entry system for creating articles. The system is designed to be implemented in a modular manner, making possible additions such as a dedicated mobile app and a future transition to a fully serverless model without disrupting the user experience.</w:t>
       </w:r>
     </w:p>
     <w:p>
@@ -655,7 +645,7 @@
           <w:tab w:val="left" w:pos="6367" w:leader="none"/>
         </w:tabs>
         <w:bidi w:val="0"/>
-        <w:spacing w:lineRule="auto" w:line="360"/>
+        <w:spacing w:lineRule="auto" w:line="360" w:before="0" w:after="0"/>
         <w:jc w:val="start"/>
         <w:rPr>
           <w:rFonts w:ascii="Calibri" w:hAnsi="Calibri"/>
@@ -706,12 +696,12 @@
           <wp:anchor behindDoc="0" distT="0" distB="0" distL="0" distR="0" simplePos="0" locked="0" layoutInCell="0" allowOverlap="1" relativeHeight="3">
             <wp:simplePos x="0" y="0"/>
             <wp:positionH relativeFrom="column">
-              <wp:posOffset>31115</wp:posOffset>
+              <wp:posOffset>-102870</wp:posOffset>
             </wp:positionH>
             <wp:positionV relativeFrom="paragraph">
-              <wp:posOffset>1045210</wp:posOffset>
+              <wp:posOffset>597535</wp:posOffset>
             </wp:positionV>
-            <wp:extent cx="6396355" cy="6301105"/>
+            <wp:extent cx="6751955" cy="5219065"/>
             <wp:effectExtent l="0" t="0" r="0" b="0"/>
             <wp:wrapSquare wrapText="largest"/>
             <wp:docPr id="1" name="Image2" descr="" title=""/>
@@ -736,7 +726,7 @@
                   <pic:spPr bwMode="auto">
                     <a:xfrm>
                       <a:off x="0" y="0"/>
-                      <a:ext cx="6396355" cy="6301105"/>
+                      <a:ext cx="6751955" cy="5219065"/>
                     </a:xfrm>
                     <a:prstGeom prst="rect">
                       <a:avLst/>
@@ -748,6 +738,63 @@
             </a:graphic>
           </wp:anchor>
         </w:drawing>
+        <mc:AlternateContent>
+          <mc:Choice Requires="wps">
+            <w:drawing>
+              <wp:anchor behindDoc="0" distT="635" distB="0" distL="635" distR="0" simplePos="0" locked="0" layoutInCell="1" allowOverlap="1" relativeHeight="4">
+                <wp:simplePos x="0" y="0"/>
+                <wp:positionH relativeFrom="column">
+                  <wp:posOffset>5207635</wp:posOffset>
+                </wp:positionH>
+                <wp:positionV relativeFrom="paragraph">
+                  <wp:posOffset>504825</wp:posOffset>
+                </wp:positionV>
+                <wp:extent cx="1440815" cy="843915"/>
+                <wp:effectExtent l="635" t="635" r="0" b="0"/>
+                <wp:wrapNone/>
+                <wp:docPr id="2" name="Shape 1"/>
+                <a:graphic xmlns:a="http://schemas.openxmlformats.org/drawingml/2006/main">
+                  <a:graphicData uri="http://schemas.microsoft.com/office/word/2010/wordprocessingShape">
+                    <wps:wsp>
+                      <wps:cNvSpPr/>
+                      <wps:spPr>
+                        <a:xfrm>
+                          <a:off x="0" y="0"/>
+                          <a:ext cx="1440720" cy="843840"/>
+                        </a:xfrm>
+                        <a:prstGeom prst="rect">
+                          <a:avLst/>
+                        </a:prstGeom>
+                        <a:solidFill>
+                          <a:srgbClr val="ffffff"/>
+                        </a:solidFill>
+                        <a:ln w="0">
+                          <a:noFill/>
+                        </a:ln>
+                      </wps:spPr>
+                      <wps:style>
+                        <a:lnRef idx="0"/>
+                        <a:fillRef idx="0"/>
+                        <a:effectRef idx="0"/>
+                        <a:fontRef idx="minor"/>
+                      </wps:style>
+                      <wps:bodyPr/>
+                    </wps:wsp>
+                  </a:graphicData>
+                </a:graphic>
+              </wp:anchor>
+            </w:drawing>
+          </mc:Choice>
+          <mc:Fallback>
+            <w:pict>
+              <v:rect id="shape_0" ID="Shape 1" path="m0,0l-2147483645,0l-2147483645,-2147483646l0,-2147483646xe" fillcolor="white" stroked="f" o:allowincell="f" style="position:absolute;margin-left:410.05pt;margin-top:39.75pt;width:113.4pt;height:66.4pt;mso-wrap-style:none;v-text-anchor:middle">
+                <v:fill o:detectmouseclick="t" type="solid" color2="black"/>
+                <v:stroke color="#3465a4" joinstyle="round" endcap="flat"/>
+                <w10:wrap type="none"/>
+              </v:rect>
+            </w:pict>
+          </mc:Fallback>
+        </mc:AlternateContent>
       </w:r>
       <w:r>
         <w:br w:type="page"/>
@@ -761,7 +808,7 @@
           <w:tab w:val="left" w:pos="6367" w:leader="none"/>
         </w:tabs>
         <w:bidi w:val="0"/>
-        <w:spacing w:lineRule="auto" w:line="360"/>
+        <w:spacing w:lineRule="auto" w:line="360" w:before="0" w:after="0"/>
         <w:jc w:val="start"/>
         <w:rPr>
           <w:rFonts w:ascii="Calibri" w:hAnsi="Calibri"/>
@@ -809,18 +856,10 @@
           <w:szCs w:val="18"/>
         </w:rPr>
         <w:drawing>
-          <wp:anchor behindDoc="0" distT="0" distB="0" distL="0" distR="0" simplePos="0" locked="0" layoutInCell="0" allowOverlap="1" relativeHeight="2">
-            <wp:simplePos x="0" y="0"/>
-            <wp:positionH relativeFrom="column">
-              <wp:posOffset>-553085</wp:posOffset>
-            </wp:positionH>
-            <wp:positionV relativeFrom="paragraph">
-              <wp:posOffset>-12700</wp:posOffset>
-            </wp:positionV>
-            <wp:extent cx="7155180" cy="8192135"/>
+          <wp:inline distT="0" distB="0" distL="0" distR="0">
+            <wp:extent cx="6343650" cy="4533900"/>
             <wp:effectExtent l="0" t="0" r="0" b="0"/>
-            <wp:wrapSquare wrapText="largest"/>
-            <wp:docPr id="2" name="Image1" descr="" title=""/>
+            <wp:docPr id="3" name="drawing" descr="" title=""/>
             <wp:cNvGraphicFramePr>
               <a:graphicFrameLocks xmlns:a="http://schemas.openxmlformats.org/drawingml/2006/main" noChangeAspect="1"/>
             </wp:cNvGraphicFramePr>
@@ -828,7 +867,7 @@
               <a:graphicData uri="http://schemas.openxmlformats.org/drawingml/2006/picture">
                 <pic:pic xmlns:pic="http://schemas.openxmlformats.org/drawingml/2006/picture">
                   <pic:nvPicPr>
-                    <pic:cNvPr id="2" name="Image1" descr="" title=""/>
+                    <pic:cNvPr id="3" name="drawing" descr="" title=""/>
                     <pic:cNvPicPr>
                       <a:picLocks noChangeAspect="1" noChangeArrowheads="1"/>
                     </pic:cNvPicPr>
@@ -842,7 +881,7 @@
                   <pic:spPr bwMode="auto">
                     <a:xfrm>
                       <a:off x="0" y="0"/>
-                      <a:ext cx="7155180" cy="8192135"/>
+                      <a:ext cx="6343650" cy="4533900"/>
                     </a:xfrm>
                     <a:prstGeom prst="rect">
                       <a:avLst/>
@@ -852,8 +891,61 @@
                 </pic:pic>
               </a:graphicData>
             </a:graphic>
-          </wp:anchor>
+          </wp:inline>
         </w:drawing>
+      </w:r>
+    </w:p>
+    <w:p>
+      <w:pPr>
+        <w:pStyle w:val="Normal"/>
+        <w:bidi w:val="0"/>
+        <w:spacing w:lineRule="auto" w:line="360"/>
+        <w:rPr>
+          <w:rFonts w:ascii="Calibri" w:hAnsi="Calibri"/>
+          <w:sz w:val="24"/>
+          <w:szCs w:val="24"/>
+        </w:rPr>
+      </w:pPr>
+      <w:r>
+        <w:rPr>
+          <w:rFonts w:eastAsia="Arial" w:cs="Arial" w:ascii="Calibri" w:hAnsi="Calibri"/>
+          <w:sz w:val="24"/>
+          <w:szCs w:val="24"/>
+          <w:lang w:val="en-CA"/>
+        </w:rPr>
+        <w:tab/>
+        <w:t>WellnessHub uses React for the user interface, Node.js and Express to handle requests, and MongoDB to store user and wellness information. These parts work together to provide a simple and secure experience for users.</w:t>
+      </w:r>
+      <w:r>
+        <w:br w:type="page"/>
+      </w:r>
+    </w:p>
+    <w:p>
+      <w:pPr>
+        <w:pStyle w:val="Normal"/>
+        <w:tabs>
+          <w:tab w:val="clear" w:pos="709"/>
+          <w:tab w:val="left" w:pos="6367" w:leader="none"/>
+        </w:tabs>
+        <w:bidi w:val="0"/>
+        <w:spacing w:lineRule="auto" w:line="360"/>
+        <w:jc w:val="start"/>
+        <w:rPr>
+          <w:rFonts w:ascii="Calibri" w:hAnsi="Calibri"/>
+          <w:b w:val="false"/>
+          <w:bCs w:val="false"/>
+          <w:sz w:val="24"/>
+          <w:szCs w:val="18"/>
+        </w:rPr>
+      </w:pPr>
+      <w:r>
+        <w:rPr>
+          <w:rFonts w:ascii="Calibri" w:hAnsi="Calibri"/>
+          <w:b w:val="false"/>
+          <w:bCs w:val="false"/>
+          <w:sz w:val="24"/>
+          <w:szCs w:val="18"/>
+        </w:rPr>
       </w:r>
     </w:p>
     <w:p>
@@ -999,7 +1091,7 @@
       </w:pPr>
       <w:r>
         <w:drawing>
-          <wp:anchor behindDoc="0" distT="0" distB="0" distL="0" distR="0" simplePos="0" locked="0" layoutInCell="0" allowOverlap="1" relativeHeight="4">
+          <wp:anchor behindDoc="0" distT="0" distB="0" distL="0" distR="0" simplePos="0" locked="0" layoutInCell="0" allowOverlap="1" relativeHeight="2">
             <wp:simplePos x="0" y="0"/>
             <wp:positionH relativeFrom="column">
               <wp:posOffset>29845</wp:posOffset>
@@ -1010,7 +1102,7 @@
             <wp:extent cx="6258560" cy="4835525"/>
             <wp:effectExtent l="0" t="0" r="0" b="0"/>
             <wp:wrapSquare wrapText="largest"/>
-            <wp:docPr id="3" name="Image3" descr="" title=""/>
+            <wp:docPr id="4" name="Image3" descr="" title=""/>
             <wp:cNvGraphicFramePr>
               <a:graphicFrameLocks xmlns:a="http://schemas.openxmlformats.org/drawingml/2006/main" noChangeAspect="1"/>
             </wp:cNvGraphicFramePr>
@@ -1018,7 +1110,7 @@
               <a:graphicData uri="http://schemas.openxmlformats.org/drawingml/2006/picture">
                 <pic:pic xmlns:pic="http://schemas.openxmlformats.org/drawingml/2006/picture">
                   <pic:nvPicPr>
-                    <pic:cNvPr id="3" name="Image3" descr="" title=""/>
+                    <pic:cNvPr id="4" name="Image3" descr="" title=""/>
                     <pic:cNvPicPr>
                       <a:picLocks noChangeAspect="1" noChangeArrowheads="1"/>
                     </pic:cNvPicPr>
@@ -1096,7 +1188,7 @@
           <w:tab w:val="left" w:pos="6367" w:leader="none"/>
         </w:tabs>
         <w:bidi w:val="0"/>
-        <w:spacing w:lineRule="auto" w:line="360"/>
+        <w:spacing w:lineRule="auto" w:line="360" w:before="0" w:after="0"/>
         <w:jc w:val="start"/>
         <w:rPr>
           <w:rFonts w:ascii="Calibri" w:hAnsi="Calibri"/>
@@ -1184,7 +1276,7 @@
           <w:tab w:val="left" w:pos="6367" w:leader="none"/>
         </w:tabs>
         <w:bidi w:val="0"/>
-        <w:spacing w:lineRule="auto" w:line="360"/>
+        <w:spacing w:lineRule="auto" w:line="360" w:before="0" w:after="0"/>
         <w:jc w:val="start"/>
         <w:rPr>
           <w:rFonts w:ascii="Calibri" w:hAnsi="Calibri"/>
@@ -1231,6 +1323,138 @@
           <w:sz w:val="24"/>
           <w:szCs w:val="18"/>
         </w:rPr>
+        <w:drawing>
+          <wp:inline distT="0" distB="0" distL="0" distR="0">
+            <wp:extent cx="6343650" cy="3314700"/>
+            <wp:effectExtent l="0" t="0" r="0" b="0"/>
+            <wp:docPr id="5" name="Image4" descr="" title=""/>
+            <wp:cNvGraphicFramePr>
+              <a:graphicFrameLocks xmlns:a="http://schemas.openxmlformats.org/drawingml/2006/main" noChangeAspect="1"/>
+            </wp:cNvGraphicFramePr>
+            <a:graphic xmlns:a="http://schemas.openxmlformats.org/drawingml/2006/main">
+              <a:graphicData uri="http://schemas.openxmlformats.org/drawingml/2006/picture">
+                <pic:pic xmlns:pic="http://schemas.openxmlformats.org/drawingml/2006/picture">
+                  <pic:nvPicPr>
+                    <pic:cNvPr id="5" name="Image4" descr="" title=""/>
+                    <pic:cNvPicPr>
+                      <a:picLocks noChangeAspect="1" noChangeArrowheads="1"/>
+                    </pic:cNvPicPr>
+                  </pic:nvPicPr>
+                  <pic:blipFill>
+                    <a:blip r:embed="rId5"/>
+                    <a:stretch>
+                      <a:fillRect/>
+                    </a:stretch>
+                  </pic:blipFill>
+                  <pic:spPr bwMode="auto">
+                    <a:xfrm>
+                      <a:off x="0" y="0"/>
+                      <a:ext cx="6343650" cy="3314700"/>
+                    </a:xfrm>
+                    <a:prstGeom prst="rect">
+                      <a:avLst/>
+                    </a:prstGeom>
+                    <a:noFill/>
+                  </pic:spPr>
+                </pic:pic>
+              </a:graphicData>
+            </a:graphic>
+          </wp:inline>
+        </w:drawing>
+      </w:r>
+    </w:p>
+    <w:p>
+      <w:pPr>
+        <w:pStyle w:val="Normal"/>
+        <w:tabs>
+          <w:tab w:val="clear" w:pos="709"/>
+          <w:tab w:val="left" w:pos="6367" w:leader="none"/>
+        </w:tabs>
+        <w:bidi w:val="0"/>
+        <w:spacing w:lineRule="auto" w:line="360"/>
+        <w:jc w:val="start"/>
+        <w:rPr>
+          <w:rFonts w:ascii="Calibri" w:hAnsi="Calibri"/>
+          <w:b w:val="false"/>
+          <w:bCs w:val="false"/>
+          <w:sz w:val="24"/>
+          <w:szCs w:val="18"/>
+        </w:rPr>
+      </w:pPr>
+      <w:r>
+        <w:rPr>
+          <w:rFonts w:ascii="Calibri" w:hAnsi="Calibri"/>
+          <w:b w:val="false"/>
+          <w:bCs w:val="false"/>
+          <w:sz w:val="24"/>
+          <w:szCs w:val="18"/>
+        </w:rPr>
+        <w:drawing>
+          <wp:inline distT="0" distB="0" distL="0" distR="0">
+            <wp:extent cx="6343650" cy="3276600"/>
+            <wp:effectExtent l="0" t="0" r="0" b="0"/>
+            <wp:docPr id="6" name="Image5" descr="" title=""/>
+            <wp:cNvGraphicFramePr>
+              <a:graphicFrameLocks xmlns:a="http://schemas.openxmlformats.org/drawingml/2006/main" noChangeAspect="1"/>
+            </wp:cNvGraphicFramePr>
+            <a:graphic xmlns:a="http://schemas.openxmlformats.org/drawingml/2006/main">
+              <a:graphicData uri="http://schemas.openxmlformats.org/drawingml/2006/picture">
+                <pic:pic xmlns:pic="http://schemas.openxmlformats.org/drawingml/2006/picture">
+                  <pic:nvPicPr>
+                    <pic:cNvPr id="6" name="Image5" descr="" title=""/>
+                    <pic:cNvPicPr>
+                      <a:picLocks noChangeAspect="1" noChangeArrowheads="1"/>
+                    </pic:cNvPicPr>
+                  </pic:nvPicPr>
+                  <pic:blipFill>
+                    <a:blip r:embed="rId6"/>
+                    <a:stretch>
+                      <a:fillRect/>
+                    </a:stretch>
+                  </pic:blipFill>
+                  <pic:spPr bwMode="auto">
+                    <a:xfrm>
+                      <a:off x="0" y="0"/>
+                      <a:ext cx="6343650" cy="3276600"/>
+                    </a:xfrm>
+                    <a:prstGeom prst="rect">
+                      <a:avLst/>
+                    </a:prstGeom>
+                    <a:noFill/>
+                  </pic:spPr>
+                </pic:pic>
+              </a:graphicData>
+            </a:graphic>
+          </wp:inline>
+        </w:drawing>
+      </w:r>
+    </w:p>
+    <w:p>
+      <w:pPr>
+        <w:pStyle w:val="Normal"/>
+        <w:tabs>
+          <w:tab w:val="clear" w:pos="709"/>
+          <w:tab w:val="left" w:pos="6367" w:leader="none"/>
+        </w:tabs>
+        <w:bidi w:val="0"/>
+        <w:spacing w:lineRule="auto" w:line="360"/>
+        <w:jc w:val="start"/>
+        <w:rPr>
+          <w:rFonts w:ascii="Calibri" w:hAnsi="Calibri"/>
+          <w:b w:val="false"/>
+          <w:bCs w:val="false"/>
+          <w:sz w:val="24"/>
+          <w:szCs w:val="18"/>
+        </w:rPr>
+      </w:pPr>
+      <w:r>
+        <w:rPr>
+          <w:rFonts w:ascii="Calibri" w:hAnsi="Calibri"/>
+          <w:b w:val="false"/>
+          <w:bCs w:val="false"/>
+          <w:sz w:val="24"/>
+          <w:szCs w:val="18"/>
+        </w:rPr>
       </w:r>
       <w:r>
         <w:br w:type="page"/>
@@ -1245,6 +1469,187 @@
         </w:tabs>
         <w:bidi w:val="0"/>
         <w:spacing w:lineRule="auto" w:line="360"/>
+        <w:jc w:val="start"/>
+        <w:rPr>
+          <w:rFonts w:ascii="Calibri" w:hAnsi="Calibri"/>
+          <w:b w:val="false"/>
+          <w:bCs w:val="false"/>
+          <w:sz w:val="24"/>
+          <w:szCs w:val="18"/>
+        </w:rPr>
+      </w:pPr>
+      <w:r>
+        <w:rPr>
+          <w:rFonts w:ascii="Calibri" w:hAnsi="Calibri"/>
+          <w:b w:val="false"/>
+          <w:bCs w:val="false"/>
+          <w:sz w:val="24"/>
+          <w:szCs w:val="18"/>
+        </w:rPr>
+        <w:drawing>
+          <wp:inline distT="0" distB="0" distL="0" distR="0">
+            <wp:extent cx="6343650" cy="3314700"/>
+            <wp:effectExtent l="0" t="0" r="0" b="0"/>
+            <wp:docPr id="7" name="Image6" descr="" title=""/>
+            <wp:cNvGraphicFramePr>
+              <a:graphicFrameLocks xmlns:a="http://schemas.openxmlformats.org/drawingml/2006/main" noChangeAspect="1"/>
+            </wp:cNvGraphicFramePr>
+            <a:graphic xmlns:a="http://schemas.openxmlformats.org/drawingml/2006/main">
+              <a:graphicData uri="http://schemas.openxmlformats.org/drawingml/2006/picture">
+                <pic:pic xmlns:pic="http://schemas.openxmlformats.org/drawingml/2006/picture">
+                  <pic:nvPicPr>
+                    <pic:cNvPr id="7" name="Image6" descr="" title=""/>
+                    <pic:cNvPicPr>
+                      <a:picLocks noChangeAspect="1" noChangeArrowheads="1"/>
+                    </pic:cNvPicPr>
+                  </pic:nvPicPr>
+                  <pic:blipFill>
+                    <a:blip r:embed="rId7"/>
+                    <a:srcRect l="0" t="7689" r="0" b="0"/>
+                    <a:stretch>
+                      <a:fillRect/>
+                    </a:stretch>
+                  </pic:blipFill>
+                  <pic:spPr bwMode="auto">
+                    <a:xfrm>
+                      <a:off x="0" y="0"/>
+                      <a:ext cx="6343650" cy="3314700"/>
+                    </a:xfrm>
+                    <a:prstGeom prst="rect">
+                      <a:avLst/>
+                    </a:prstGeom>
+                    <a:noFill/>
+                  </pic:spPr>
+                </pic:pic>
+              </a:graphicData>
+            </a:graphic>
+          </wp:inline>
+        </w:drawing>
+      </w:r>
+    </w:p>
+    <w:p>
+      <w:pPr>
+        <w:pStyle w:val="Normal"/>
+        <w:tabs>
+          <w:tab w:val="clear" w:pos="709"/>
+          <w:tab w:val="left" w:pos="6367" w:leader="none"/>
+        </w:tabs>
+        <w:bidi w:val="0"/>
+        <w:spacing w:lineRule="auto" w:line="360"/>
+        <w:jc w:val="start"/>
+        <w:rPr>
+          <w:rFonts w:ascii="Calibri" w:hAnsi="Calibri"/>
+          <w:b w:val="false"/>
+          <w:bCs w:val="false"/>
+          <w:sz w:val="24"/>
+          <w:szCs w:val="18"/>
+        </w:rPr>
+      </w:pPr>
+      <w:r>
+        <w:rPr>
+          <w:rFonts w:ascii="Calibri" w:hAnsi="Calibri"/>
+          <w:b w:val="false"/>
+          <w:bCs w:val="false"/>
+          <w:sz w:val="24"/>
+          <w:szCs w:val="18"/>
+        </w:rPr>
+        <w:drawing>
+          <wp:inline distT="0" distB="0" distL="0" distR="0">
+            <wp:extent cx="6343650" cy="3429000"/>
+            <wp:effectExtent l="0" t="0" r="0" b="0"/>
+            <wp:docPr id="8" name="Image7" descr="" title=""/>
+            <wp:cNvGraphicFramePr>
+              <a:graphicFrameLocks xmlns:a="http://schemas.openxmlformats.org/drawingml/2006/main" noChangeAspect="1"/>
+            </wp:cNvGraphicFramePr>
+            <a:graphic xmlns:a="http://schemas.openxmlformats.org/drawingml/2006/main">
+              <a:graphicData uri="http://schemas.openxmlformats.org/drawingml/2006/picture">
+                <pic:pic xmlns:pic="http://schemas.openxmlformats.org/drawingml/2006/picture">
+                  <pic:nvPicPr>
+                    <pic:cNvPr id="8" name="Image7" descr="" title=""/>
+                    <pic:cNvPicPr>
+                      <a:picLocks noChangeAspect="1" noChangeArrowheads="1"/>
+                    </pic:cNvPicPr>
+                  </pic:nvPicPr>
+                  <pic:blipFill>
+                    <a:blip r:embed="rId8"/>
+                    <a:srcRect l="0" t="8862" r="0" b="0"/>
+                    <a:stretch>
+                      <a:fillRect/>
+                    </a:stretch>
+                  </pic:blipFill>
+                  <pic:spPr bwMode="auto">
+                    <a:xfrm>
+                      <a:off x="0" y="0"/>
+                      <a:ext cx="6343650" cy="3429000"/>
+                    </a:xfrm>
+                    <a:prstGeom prst="rect">
+                      <a:avLst/>
+                    </a:prstGeom>
+                    <a:noFill/>
+                  </pic:spPr>
+                </pic:pic>
+              </a:graphicData>
+            </a:graphic>
+          </wp:inline>
+        </w:drawing>
+      </w:r>
+    </w:p>
+    <w:p>
+      <w:pPr>
+        <w:pStyle w:val="Normal"/>
+        <w:bidi w:val="0"/>
+        <w:spacing w:lineRule="auto" w:line="360"/>
+        <w:rPr>
+          <w:rFonts w:ascii="Calibri" w:hAnsi="Calibri"/>
+        </w:rPr>
+      </w:pPr>
+      <w:r>
+        <w:rPr>
+          <w:rFonts w:eastAsia="Arial" w:cs="Arial" w:ascii="Calibri" w:hAnsi="Calibri"/>
+          <w:sz w:val="24"/>
+          <w:szCs w:val="24"/>
+          <w:lang w:val="en-CA"/>
+        </w:rPr>
+        <w:tab/>
+        <w:t>The sequence diagrams show how the user, React interface, Node.js/Express server, and MongoDB communicate with each other. They explain the step-by-step process for logging in, recording wellness activities, receiving recommendations, and tracking goals.</w:t>
+      </w:r>
+    </w:p>
+    <w:p>
+      <w:pPr>
+        <w:pStyle w:val="Normal"/>
+        <w:bidi w:val="0"/>
+        <w:spacing w:lineRule="auto" w:line="360"/>
+        <w:jc w:val="start"/>
+        <w:rPr>
+          <w:rFonts w:ascii="Calibri" w:hAnsi="Calibri"/>
+          <w:b w:val="false"/>
+          <w:bCs w:val="false"/>
+          <w:sz w:val="24"/>
+          <w:szCs w:val="18"/>
+        </w:rPr>
+      </w:pPr>
+      <w:r>
+        <w:rPr>
+          <w:rFonts w:ascii="Calibri" w:hAnsi="Calibri"/>
+          <w:b w:val="false"/>
+          <w:bCs w:val="false"/>
+          <w:sz w:val="24"/>
+          <w:szCs w:val="18"/>
+        </w:rPr>
+      </w:r>
+      <w:r>
+        <w:br w:type="page"/>
+      </w:r>
+    </w:p>
+    <w:p>
+      <w:pPr>
+        <w:pStyle w:val="Normal"/>
+        <w:tabs>
+          <w:tab w:val="clear" w:pos="709"/>
+          <w:tab w:val="left" w:pos="6367" w:leader="none"/>
+        </w:tabs>
+        <w:bidi w:val="0"/>
+        <w:spacing w:lineRule="auto" w:line="360" w:before="0" w:after="0"/>
         <w:jc w:val="start"/>
         <w:rPr>
           <w:rFonts w:ascii="Calibri" w:hAnsi="Calibri"/>
@@ -1332,7 +1737,7 @@
           <w:tab w:val="left" w:pos="6367" w:leader="none"/>
         </w:tabs>
         <w:bidi w:val="0"/>
-        <w:spacing w:lineRule="auto" w:line="360"/>
+        <w:spacing w:lineRule="auto" w:line="360" w:before="0" w:after="0"/>
         <w:jc w:val="start"/>
         <w:rPr>
           <w:rFonts w:ascii="Calibri" w:hAnsi="Calibri"/>

</xml_diff>